<commit_message>
docs+tools: TED drive lands on the README + journal cover; README ToC; serial run logger
Team name confirmed by the team 2026-08-10: TED drive. README header TBDs filled (members Ethan Fernandes / Tejas Sirikonda / Diaan, coach Amey Chavan, OMOTEC) and a one-line Contents index added - the README had 8 sections and no ToC. Journal cover: team name + Tejas's surname filled (2 of the Appendix-B checklist items); the rest of the checklist stays yellow on purpose. tools/serial_log.py: timestamped host-side capture of the ESP32 telemetry - the instrument for the still-missing logged run (loop rate, [turn] n/12, run-on timing all fall out of one capture); logs/ is created at runtime and stays untracked. 5_reproducibility layout row added for tools/. NOTE: the journal lists two members while the README lists three (Diaan) - roster to be confirmed against the registration before the journal prints.
</commit_message>
<xml_diff>
--- a/docs/engineering_journal_DRAFT.docx
+++ b/docs/engineering_journal_DRAFT.docx
@@ -53,7 +53,7 @@
           <w:highlight w:val="yellow"/>
           <w:highlightCs w:val="yellow"/>
         </w:rPr>
-        <w:t xml:space="preserve">[TEAM NAME — confirm registered name with coach]</w:t>
+        <w:t xml:space="preserve">TED drive</w:t>
       </w:r>
     </w:p>
     <w:p>
@@ -75,7 +75,7 @@
           <w:highlight w:val="yellow"/>
           <w:highlightCs w:val="yellow"/>
         </w:rPr>
-        <w:t xml:space="preserve">[surname]</w:t>
+        <w:t xml:space="preserve">Sirikonda</w:t>
       </w:r>
     </w:p>
     <w:p>

</xml_diff>

<commit_message>
docs(journal): pre-print truth pass - pack 2200 mAh x3, as-built power topology (servo on Buck-2, ESP32 from Pi USB), roster +Diaan, models/ status current, run-video links filled
</commit_message>
<xml_diff>
--- a/docs/engineering_journal_DRAFT.docx
+++ b/docs/engineering_journal_DRAFT.docx
@@ -75,7 +75,7 @@
           <w:highlight w:val="yellow"/>
           <w:highlightCs w:val="yellow"/>
         </w:rPr>
-        <w:t xml:space="preserve">Sirikonda</w:t>
+        <w:t xml:space="preserve">Sirikonda  ·  Diaan</w:t>
       </w:r>
     </w:p>
     <w:p>
@@ -470,7 +470,7 @@
         <w:spacing w:after="120" w:line="276"/>
       </w:pPr>
       <w:r>
-        <w:t xml:space="preserve">One battery powers everything: a 3S Li-Po, 11.1 V nominal, 2600 mAh, terminated in a DC jack. The pack feeds a buck converter that produces the 5 V rail for the ESP32 and the steering servo; the drive motor takes battery voltage through a TB6612FNG driver (direction pins + PWM, with the driver's standby line held enabled). The Raspberry Pi 5 runs from the same pack through its own regulator.</w:t>
+        <w:t xml:space="preserve">One battery powers everything: a 3S Li-Po, 11.1 V nominal, 2200 mAh, terminated in a DC jack. The pack feeds two buck converters: Buck-2 supplies the 5 V rail for the steering servo and the three rangefinders; the ESP32 is powered from the Raspberry Pi's USB port and sends the servo signal only; the Pi 5 runs from the pack through a fast-charge regulator module; and the drive motor takes battery voltage through a TB6612FNG driver (direction pins + PWM, with the driver's standby line driven enabled). This matches schemes/circuit_diagram_complete_2026-08-11.jpg — the harness was reworked on 2026-08-11 to move servo power off the ESP32's 5 V chain, closing a failure point our power document had named.</w:t>
       </w:r>
     </w:p>
     <w:p>
@@ -1081,7 +1081,7 @@
         <w:spacing w:after="120" w:line="276"/>
       </w:pPr>
       <w:r>
-        <w:t xml:space="preserve">Runtime check: 2600 mAh against the measured cruise total gives our laps-per-charge margin: </w:t>
+        <w:t xml:space="preserve">Runtime check: 2200 mAh against the measured cruise total gives our laps-per-charge margin: </w:t>
       </w:r>
       <w:r>
         <w:rPr>
@@ -1923,7 +1923,7 @@
         <w:spacing w:after="80" w:line="276"/>
       </w:pPr>
       <w:r>
-        <w:t xml:space="preserve">schemes/ — the wiring schematics (v0.2, signal + power, script-generated). models/ — printed mount CAD (3 rangefinder, servo, motor mounts) </w:t>
+        <w:t xml:space="preserve">schemes/ — the wiring schematics (v0.2, signal + power, script-generated). models/ — committed CAD (2026-08-11): TF-Luna enclosure and steering horn (original, Fusion 360) plus the initial LEGO design (LXFML); third-party camera-mount STLs are cited in models/README, not redistributed </w:t>
       </w:r>
       <w:r>
         <w:rPr>
@@ -1932,7 +1932,7 @@
           <w:highlight w:val="yellow"/>
           <w:highlightCs w:val="yellow"/>
         </w:rPr>
-        <w:t xml:space="preserve">[mount CAD commit pending]</w:t>
+        <w:t xml:space="preserve">(landed 2026-08-11)</w:t>
       </w:r>
       <w:r>
         <w:t xml:space="preserve">. t-photos/, v-photos/, video.md — team, vehicle, and run-video evidence.</w:t>
@@ -2047,7 +2047,7 @@
           <w:highlight w:val="yellow"/>
           <w:highlightCs w:val="yellow"/>
         </w:rPr>
-        <w:t xml:space="preserve">[FILL the two links here as well]</w:t>
+        <w:t xml:space="preserve">Open Challenge: youtu.be/PbOQJ54wr-0 (33 s) · Obstacle Challenge: youtu.be/dBjqMQ-jRBA (100 s); both unlisted-by-link, uploaded 2026-08-12.</w:t>
       </w:r>
     </w:p>
     <w:tbl>
@@ -2697,7 +2697,7 @@
                 <w:b w:val="false"/>
                 <w:bCs w:val="false"/>
               </w:rPr>
-              <w:t xml:space="preserve">3S Li-Po 11.1 V 2600 mAh (DC jack)</w:t>
+              <w:t xml:space="preserve">3S Li-Po 11.1 V 2200 mAh (DC jack)</w:t>
             </w:r>
           </w:p>
         </w:tc>

</xml_diff>